<commit_message>
Fix ARS growth report: sync HTML with duplicate JS variable removed.
The production page was blank because equilibriumWarning was declared twice, breaking the entire script.

Co-authored-by: Cursor <cursoragent@cursor.com>
</commit_message>
<xml_diff>
--- a/public/reports/reporte-crecimiento-ingresos-egresos-ars.docx
+++ b/public/reports/reporte-crecimiento-ingresos-egresos-ars.docx
@@ -40,7 +40,7 @@
           <w:color w:val="6B7280"/>
           <w:sz w:val="18"/>
         </w:rPr>
-        <w:t>Fuente: REGISTRO GASTOS E INGRESOS - POW S.A - [ARCHIVO POW] - 5.xlsx · hoja ESTADO DE RESULTADOS + EGRESOS | POW (Total - Sueldos) · Generado 16/06/2026</w:t>
+        <w:t>Fuente: REGISTRO GASTOS E INGRESOS - POW S.A - [ARCHIVO POW] (28-Jun).xlsx · hoja ESTADO DE RESULTADOS + EGRESOS | POW (Total - Sueldos) · Generado 28/06/2026</w:t>
       </w:r>
     </w:p>
     <w:p>
@@ -276,7 +276,7 @@
                 <w:b w:val="0"/>
                 <w:sz w:val="20"/>
               </w:rPr>
-              <w:t>$3.48B</w:t>
+              <w:t>$3.51B</w:t>
             </w:r>
           </w:p>
         </w:tc>
@@ -303,7 +303,7 @@
                 <w:color w:val="059669"/>
                 <w:sz w:val="20"/>
               </w:rPr>
-              <w:t>+27.4%</w:t>
+              <w:t>+28.3%</w:t>
             </w:r>
           </w:p>
         </w:tc>
@@ -383,7 +383,7 @@
                 <w:b w:val="0"/>
                 <w:sz w:val="20"/>
               </w:rPr>
-              <w:t>$3.30B</w:t>
+              <w:t>$3.20B</w:t>
             </w:r>
           </w:p>
         </w:tc>
@@ -410,7 +410,7 @@
                 <w:color w:val="DC2626"/>
                 <w:sz w:val="20"/>
               </w:rPr>
-              <w:t>+43.2%</w:t>
+              <w:t>+38.6%</w:t>
             </w:r>
           </w:p>
         </w:tc>
@@ -490,7 +490,7 @@
                 <w:b w:val="0"/>
                 <w:sz w:val="20"/>
               </w:rPr>
-              <w:t>$2.30B</w:t>
+              <w:t>$2.23B</w:t>
             </w:r>
           </w:p>
         </w:tc>
@@ -517,7 +517,7 @@
                 <w:color w:val="DC2626"/>
                 <w:sz w:val="20"/>
               </w:rPr>
-              <w:t>+42.6%</w:t>
+              <w:t>+38.5%</w:t>
             </w:r>
           </w:p>
         </w:tc>
@@ -535,7 +535,7 @@
           <w:i w:val="0"/>
           <w:sz w:val="22"/>
         </w:rPr>
-        <w:t>Brecha egresos vs ingresos en ARS: +15.8 puntos porcentuales (+43.2% egresos vs +27.4% ingresos).</w:t>
+        <w:t>Brecha egresos vs ingresos en ARS: +10.3 puntos porcentuales (+38.6% egresos vs +28.3% ingresos).</w:t>
       </w:r>
     </w:p>
     <w:p>
@@ -724,7 +724,7 @@
                 <w:b w:val="0"/>
                 <w:sz w:val="20"/>
               </w:rPr>
-              <w:t>+9.2%</w:t>
+              <w:t>+10.3%</w:t>
             </w:r>
           </w:p>
         </w:tc>
@@ -804,7 +804,7 @@
                 <w:b w:val="0"/>
                 <w:sz w:val="20"/>
               </w:rPr>
-              <w:t>+22.6%</w:t>
+              <w:t>+19.2%</w:t>
             </w:r>
           </w:p>
         </w:tc>
@@ -1055,7 +1055,7 @@
                 <w:b w:val="0"/>
                 <w:sz w:val="20"/>
               </w:rPr>
-              <w:t>$1.69B</w:t>
+              <w:t>$1.71B</w:t>
             </w:r>
           </w:p>
         </w:tc>
@@ -1082,7 +1082,7 @@
                 <w:color w:val="059669"/>
                 <w:sz w:val="20"/>
               </w:rPr>
-              <w:t>+32.1%</w:t>
+              <w:t>+34.0%</w:t>
             </w:r>
           </w:p>
         </w:tc>
@@ -1108,7 +1108,7 @@
                 <w:b w:val="0"/>
                 <w:sz w:val="20"/>
               </w:rPr>
-              <w:t>+10.3%</w:t>
+              <w:t>+12.3%</w:t>
             </w:r>
           </w:p>
         </w:tc>
@@ -1188,7 +1188,7 @@
                 <w:b w:val="0"/>
                 <w:sz w:val="20"/>
               </w:rPr>
-              <w:t>$1.54B</w:t>
+              <w:t>$1.52B</w:t>
             </w:r>
           </w:p>
         </w:tc>
@@ -1215,7 +1215,7 @@
                 <w:color w:val="DC2626"/>
                 <w:sz w:val="20"/>
               </w:rPr>
-              <w:t>+49.3%</w:t>
+              <w:t>+47.4%</w:t>
             </w:r>
           </w:p>
         </w:tc>
@@ -1241,7 +1241,7 @@
                 <w:b w:val="0"/>
                 <w:sz w:val="20"/>
               </w:rPr>
-              <w:t>+24.4%</w:t>
+              <w:t>+23.5%</w:t>
             </w:r>
           </w:p>
         </w:tc>
@@ -1348,7 +1348,7 @@
                 <w:color w:val="DC2626"/>
                 <w:sz w:val="20"/>
               </w:rPr>
-              <w:t>+45.9%</w:t>
+              <w:t>+45.1%</w:t>
             </w:r>
           </w:p>
         </w:tc>
@@ -2128,7 +2128,7 @@
                 <w:b w:val="0"/>
                 <w:sz w:val="20"/>
               </w:rPr>
-              <w:t>+161.2%</w:t>
+              <w:t>+161.3%</w:t>
             </w:r>
           </w:p>
         </w:tc>
@@ -2206,7 +2206,7 @@
                 <w:b w:val="0"/>
                 <w:sz w:val="20"/>
               </w:rPr>
-              <w:t>+36.8%</w:t>
+              <w:t>+36.9%</w:t>
             </w:r>
           </w:p>
         </w:tc>
@@ -2418,7 +2418,7 @@
                 <w:b w:val="0"/>
                 <w:sz w:val="20"/>
               </w:rPr>
-              <w:t>+27.4%</w:t>
+              <w:t>+28.3%</w:t>
             </w:r>
           </w:p>
         </w:tc>
@@ -2444,7 +2444,7 @@
                 <w:b w:val="0"/>
                 <w:sz w:val="20"/>
               </w:rPr>
-              <w:t>+43.2%</w:t>
+              <w:t>+38.6%</w:t>
             </w:r>
           </w:p>
         </w:tc>
@@ -2470,7 +2470,7 @@
                 <w:b w:val="0"/>
                 <w:sz w:val="20"/>
               </w:rPr>
-              <w:t>+42.6%</w:t>
+              <w:t>+38.5%</w:t>
             </w:r>
           </w:p>
         </w:tc>
@@ -2496,7 +2496,7 @@
                 <w:b w:val="0"/>
                 <w:sz w:val="20"/>
               </w:rPr>
-              <w:t>+9.2%</w:t>
+              <w:t>+10.3%</w:t>
             </w:r>
           </w:p>
         </w:tc>
@@ -2522,7 +2522,7 @@
                 <w:b w:val="0"/>
                 <w:sz w:val="20"/>
               </w:rPr>
-              <w:t>+22.6%</w:t>
+              <w:t>+19.2%</w:t>
             </w:r>
           </w:p>
         </w:tc>
@@ -2660,7 +2660,7 @@
                 <w:b w:val="0"/>
                 <w:sz w:val="20"/>
               </w:rPr>
-              <w:t>69.9%</w:t>
+              <w:t>69.8%</w:t>
             </w:r>
           </w:p>
         </w:tc>
@@ -2768,7 +2768,7 @@
                 <w:b w:val="0"/>
                 <w:sz w:val="20"/>
               </w:rPr>
-              <w:t>69.5%</w:t>
+              <w:t>69.8%</w:t>
             </w:r>
           </w:p>
         </w:tc>

</xml_diff>